<commit_message>
Make worker transform PPT templates with LLM
</commit_message>
<xml_diff>
--- a/sample_uploads/content.docx
+++ b/sample_uploads/content.docx
@@ -11,21 +11,8 @@
       </w:r>
     </w:p>
     <w:p>
-      <w:pPr>
-        <w:pStyle w:val="Heading1"/>
-      </w:pPr>
       <w:r>
-        <w:t>Revenue Highlights</w:t>
-      </w:r>
-    </w:p>
-    <w:p>
-      <w:r>
-        <w:t>Revenue increased 18 percent year over year driven by enterprise expansion.</w:t>
-      </w:r>
-    </w:p>
-    <w:p>
-      <w:r>
-        <w:t>Gross margin improved by 3 percentage points due to infrastructure optimization.</w:t>
+        <w:t>Prepared for management review. This document contains narrative sections and tables intended to exercise the Prompt-to-PPT parser, LLM outline generation, and final PPT builder.</w:t>
       </w:r>
     </w:p>
     <w:p>
@@ -33,12 +20,650 @@
         <w:pStyle w:val="Heading1"/>
       </w:pPr>
       <w:r>
-        <w:t>Next Quarter Focus</w:t>
+        <w:t>Executive Snapshot</w:t>
       </w:r>
     </w:p>
     <w:p>
+      <w:pPr>
+        <w:pStyle w:val="ListBullet"/>
+      </w:pPr>
       <w:r>
-        <w:t>Focus on customer retention, AI product packaging, and cloud cost efficiency.</w:t>
+        <w:t>Q1 closed ahead of plan with stronger enterprise demand and improved renewal discipline.</w:t>
+      </w:r>
+    </w:p>
+    <w:p>
+      <w:pPr>
+        <w:pStyle w:val="ListBullet"/>
+      </w:pPr>
+      <w:r>
+        <w:t>The team should emphasize expansion revenue, customer health, and delivery focus in the generated deck.</w:t>
+      </w:r>
+    </w:p>
+    <w:p>
+      <w:pPr>
+        <w:pStyle w:val="ListBullet"/>
+      </w:pPr>
+      <w:r>
+        <w:t>The primary decision is whether to increase Q2 investment in onboarding capacity and partner enablement.</w:t>
+      </w:r>
+    </w:p>
+    <w:p>
+      <w:pPr>
+        <w:pStyle w:val="Heading1"/>
+      </w:pPr>
+      <w:r>
+        <w:t>Revenue Performance</w:t>
+      </w:r>
+    </w:p>
+    <w:p>
+      <w:pPr>
+        <w:pStyle w:val="ListBullet"/>
+      </w:pPr>
+      <w:r>
+        <w:t>Total revenue reached 18.4M, up 16 percent quarter over quarter and 9 percent above plan.</w:t>
+      </w:r>
+    </w:p>
+    <w:p>
+      <w:pPr>
+        <w:pStyle w:val="ListBullet"/>
+      </w:pPr>
+      <w:r>
+        <w:t>Enterprise ARR contributed the majority of growth, with financial services and manufacturing outperforming forecast.</w:t>
+      </w:r>
+    </w:p>
+    <w:p>
+      <w:pPr>
+        <w:pStyle w:val="ListBullet"/>
+      </w:pPr>
+      <w:r>
+        <w:t>Services revenue was stable, but margin improved after tighter project scoping and lower subcontractor dependency.</w:t>
+      </w:r>
+    </w:p>
+    <w:p>
+      <w:pPr>
+        <w:pStyle w:val="Heading1"/>
+      </w:pPr>
+      <w:r>
+        <w:t>Customer Adoption</w:t>
+      </w:r>
+    </w:p>
+    <w:p>
+      <w:pPr>
+        <w:pStyle w:val="ListBullet"/>
+      </w:pPr>
+      <w:r>
+        <w:t>Active enterprise accounts grew from 42 to 51, while weekly active users increased 28 percent.</w:t>
+      </w:r>
+    </w:p>
+    <w:p>
+      <w:pPr>
+        <w:pStyle w:val="ListBullet"/>
+      </w:pPr>
+      <w:r>
+        <w:t>The strongest adoption signal came from workflow automation features and analytics exports.</w:t>
+      </w:r>
+    </w:p>
+    <w:p>
+      <w:pPr>
+        <w:pStyle w:val="ListBullet"/>
+      </w:pPr>
+      <w:r>
+        <w:t>Three strategic accounts remain at risk because onboarding milestones slipped by more than two weeks.</w:t>
+      </w:r>
+    </w:p>
+    <w:p>
+      <w:pPr>
+        <w:pStyle w:val="Heading1"/>
+      </w:pPr>
+      <w:r>
+        <w:t>Product Delivery</w:t>
+      </w:r>
+    </w:p>
+    <w:p>
+      <w:pPr>
+        <w:pStyle w:val="ListBullet"/>
+      </w:pPr>
+      <w:r>
+        <w:t>The product team shipped the analytics dashboard, workspace templates, and security audit trail in Q1.</w:t>
+      </w:r>
+    </w:p>
+    <w:p>
+      <w:pPr>
+        <w:pStyle w:val="ListBullet"/>
+      </w:pPr>
+      <w:r>
+        <w:t>The roadmap is on track for API governance, improved admin controls, and workflow recommendations in Q2.</w:t>
+      </w:r>
+    </w:p>
+    <w:p>
+      <w:pPr>
+        <w:pStyle w:val="ListBullet"/>
+      </w:pPr>
+      <w:r>
+        <w:t>Platform reliability improved with median API latency down 19 percent and incident count down from 7 to 3.</w:t>
+      </w:r>
+    </w:p>
+    <w:p>
+      <w:pPr>
+        <w:pStyle w:val="Heading1"/>
+      </w:pPr>
+      <w:r>
+        <w:t>Risks and Mitigations</w:t>
+      </w:r>
+    </w:p>
+    <w:p>
+      <w:pPr>
+        <w:pStyle w:val="ListBullet"/>
+      </w:pPr>
+      <w:r>
+        <w:t>Implementation capacity is the largest near-term risk as enterprise onboarding volume increases.</w:t>
+      </w:r>
+    </w:p>
+    <w:p>
+      <w:pPr>
+        <w:pStyle w:val="ListBullet"/>
+      </w:pPr>
+      <w:r>
+        <w:t>Data quality remains uneven across customer imports, which can slow time-to-value for complex deployments.</w:t>
+      </w:r>
+    </w:p>
+    <w:p>
+      <w:pPr>
+        <w:pStyle w:val="ListBullet"/>
+      </w:pPr>
+      <w:r>
+        <w:t>Mitigation plan: add two onboarding specialists, publish stricter import validation, and expand partner training.</w:t>
+      </w:r>
+    </w:p>
+    <w:p>
+      <w:pPr>
+        <w:pStyle w:val="Heading1"/>
+      </w:pPr>
+      <w:r>
+        <w:t>Q2 Recommendations</w:t>
+      </w:r>
+    </w:p>
+    <w:p>
+      <w:pPr>
+        <w:pStyle w:val="ListBullet"/>
+      </w:pPr>
+      <w:r>
+        <w:t>Increase customer success capacity for strategic accounts before pipeline conversion peaks in May.</w:t>
+      </w:r>
+    </w:p>
+    <w:p>
+      <w:pPr>
+        <w:pStyle w:val="ListBullet"/>
+      </w:pPr>
+      <w:r>
+        <w:t>Prioritize automation analytics and admin controls because they are tied to expansion opportunities.</w:t>
+      </w:r>
+    </w:p>
+    <w:p>
+      <w:pPr>
+        <w:pStyle w:val="ListBullet"/>
+      </w:pPr>
+      <w:r>
+        <w:t>Create a weekly executive operating review around renewal risk, onboarding milestones, and product adoption.</w:t>
+      </w:r>
+    </w:p>
+    <w:tbl>
+      <w:tblPr>
+        <w:tblStyle w:val="TableGrid"/>
+        <w:tblW w:type="auto" w:w="0"/>
+        <w:tblLook w:firstColumn="1" w:firstRow="1" w:lastColumn="0" w:lastRow="0" w:noHBand="0" w:noVBand="1" w:val="04A0"/>
+      </w:tblPr>
+      <w:tblGrid>
+        <w:gridCol w:w="2160"/>
+        <w:gridCol w:w="2160"/>
+        <w:gridCol w:w="2160"/>
+        <w:gridCol w:w="2160"/>
+      </w:tblGrid>
+      <w:tr>
+        <w:tc>
+          <w:tcPr>
+            <w:tcW w:type="dxa" w:w="2160"/>
+          </w:tcPr>
+          <w:p>
+            <w:r>
+              <w:t>Metric</w:t>
+            </w:r>
+          </w:p>
+        </w:tc>
+        <w:tc>
+          <w:tcPr>
+            <w:tcW w:type="dxa" w:w="2160"/>
+          </w:tcPr>
+          <w:p>
+            <w:r>
+              <w:t>Q4 Actual</w:t>
+            </w:r>
+          </w:p>
+        </w:tc>
+        <w:tc>
+          <w:tcPr>
+            <w:tcW w:type="dxa" w:w="2160"/>
+          </w:tcPr>
+          <w:p>
+            <w:r>
+              <w:t>Q1 Actual</w:t>
+            </w:r>
+          </w:p>
+        </w:tc>
+        <w:tc>
+          <w:tcPr>
+            <w:tcW w:type="dxa" w:w="2160"/>
+          </w:tcPr>
+          <w:p>
+            <w:r>
+              <w:t>Q1 Plan</w:t>
+            </w:r>
+          </w:p>
+        </w:tc>
+      </w:tr>
+      <w:tr>
+        <w:tc>
+          <w:tcPr>
+            <w:tcW w:type="dxa" w:w="2160"/>
+          </w:tcPr>
+          <w:p>
+            <w:r>
+              <w:t>Revenue</w:t>
+            </w:r>
+          </w:p>
+        </w:tc>
+        <w:tc>
+          <w:tcPr>
+            <w:tcW w:type="dxa" w:w="2160"/>
+          </w:tcPr>
+          <w:p>
+            <w:r>
+              <w:t>15.9M</w:t>
+            </w:r>
+          </w:p>
+        </w:tc>
+        <w:tc>
+          <w:tcPr>
+            <w:tcW w:type="dxa" w:w="2160"/>
+          </w:tcPr>
+          <w:p>
+            <w:r>
+              <w:t>18.4M</w:t>
+            </w:r>
+          </w:p>
+        </w:tc>
+        <w:tc>
+          <w:tcPr>
+            <w:tcW w:type="dxa" w:w="2160"/>
+          </w:tcPr>
+          <w:p>
+            <w:r>
+              <w:t>16.9M</w:t>
+            </w:r>
+          </w:p>
+        </w:tc>
+      </w:tr>
+      <w:tr>
+        <w:tc>
+          <w:tcPr>
+            <w:tcW w:type="dxa" w:w="2160"/>
+          </w:tcPr>
+          <w:p>
+            <w:r>
+              <w:t>Gross Margin</w:t>
+            </w:r>
+          </w:p>
+        </w:tc>
+        <w:tc>
+          <w:tcPr>
+            <w:tcW w:type="dxa" w:w="2160"/>
+          </w:tcPr>
+          <w:p>
+            <w:r>
+              <w:t>63%</w:t>
+            </w:r>
+          </w:p>
+        </w:tc>
+        <w:tc>
+          <w:tcPr>
+            <w:tcW w:type="dxa" w:w="2160"/>
+          </w:tcPr>
+          <w:p>
+            <w:r>
+              <w:t>67%</w:t>
+            </w:r>
+          </w:p>
+        </w:tc>
+        <w:tc>
+          <w:tcPr>
+            <w:tcW w:type="dxa" w:w="2160"/>
+          </w:tcPr>
+          <w:p>
+            <w:r>
+              <w:t>65%</w:t>
+            </w:r>
+          </w:p>
+        </w:tc>
+      </w:tr>
+      <w:tr>
+        <w:tc>
+          <w:tcPr>
+            <w:tcW w:type="dxa" w:w="2160"/>
+          </w:tcPr>
+          <w:p>
+            <w:r>
+              <w:t>Net Revenue Retention</w:t>
+            </w:r>
+          </w:p>
+        </w:tc>
+        <w:tc>
+          <w:tcPr>
+            <w:tcW w:type="dxa" w:w="2160"/>
+          </w:tcPr>
+          <w:p>
+            <w:r>
+              <w:t>112%</w:t>
+            </w:r>
+          </w:p>
+        </w:tc>
+        <w:tc>
+          <w:tcPr>
+            <w:tcW w:type="dxa" w:w="2160"/>
+          </w:tcPr>
+          <w:p>
+            <w:r>
+              <w:t>119%</w:t>
+            </w:r>
+          </w:p>
+        </w:tc>
+        <w:tc>
+          <w:tcPr>
+            <w:tcW w:type="dxa" w:w="2160"/>
+          </w:tcPr>
+          <w:p>
+            <w:r>
+              <w:t>115%</w:t>
+            </w:r>
+          </w:p>
+        </w:tc>
+      </w:tr>
+      <w:tr>
+        <w:tc>
+          <w:tcPr>
+            <w:tcW w:type="dxa" w:w="2160"/>
+          </w:tcPr>
+          <w:p>
+            <w:r>
+              <w:t>Enterprise Accounts</w:t>
+            </w:r>
+          </w:p>
+        </w:tc>
+        <w:tc>
+          <w:tcPr>
+            <w:tcW w:type="dxa" w:w="2160"/>
+          </w:tcPr>
+          <w:p>
+            <w:r>
+              <w:t>42</w:t>
+            </w:r>
+          </w:p>
+        </w:tc>
+        <w:tc>
+          <w:tcPr>
+            <w:tcW w:type="dxa" w:w="2160"/>
+          </w:tcPr>
+          <w:p>
+            <w:r>
+              <w:t>51</w:t>
+            </w:r>
+          </w:p>
+        </w:tc>
+        <w:tc>
+          <w:tcPr>
+            <w:tcW w:type="dxa" w:w="2160"/>
+          </w:tcPr>
+          <w:p>
+            <w:r>
+              <w:t>48</w:t>
+            </w:r>
+          </w:p>
+        </w:tc>
+      </w:tr>
+    </w:tbl>
+    <w:p>
+      <w:pPr>
+        <w:pStyle w:val="Heading1"/>
+      </w:pPr>
+      <w:r>
+        <w:t>Initiative Status</w:t>
+      </w:r>
+    </w:p>
+    <w:tbl>
+      <w:tblPr>
+        <w:tblStyle w:val="TableGrid"/>
+        <w:tblW w:type="auto" w:w="0"/>
+        <w:tblLook w:firstColumn="1" w:firstRow="1" w:lastColumn="0" w:lastRow="0" w:noHBand="0" w:noVBand="1" w:val="04A0"/>
+      </w:tblPr>
+      <w:tblGrid>
+        <w:gridCol w:w="2160"/>
+        <w:gridCol w:w="2160"/>
+        <w:gridCol w:w="2160"/>
+        <w:gridCol w:w="2160"/>
+      </w:tblGrid>
+      <w:tr>
+        <w:tc>
+          <w:tcPr>
+            <w:tcW w:type="dxa" w:w="2160"/>
+          </w:tcPr>
+          <w:p>
+            <w:r>
+              <w:t>Initiative</w:t>
+            </w:r>
+          </w:p>
+        </w:tc>
+        <w:tc>
+          <w:tcPr>
+            <w:tcW w:type="dxa" w:w="2160"/>
+          </w:tcPr>
+          <w:p>
+            <w:r>
+              <w:t>Owner</w:t>
+            </w:r>
+          </w:p>
+        </w:tc>
+        <w:tc>
+          <w:tcPr>
+            <w:tcW w:type="dxa" w:w="2160"/>
+          </w:tcPr>
+          <w:p>
+            <w:r>
+              <w:t>Status</w:t>
+            </w:r>
+          </w:p>
+        </w:tc>
+        <w:tc>
+          <w:tcPr>
+            <w:tcW w:type="dxa" w:w="2160"/>
+          </w:tcPr>
+          <w:p>
+            <w:r>
+              <w:t>Q2 Focus</w:t>
+            </w:r>
+          </w:p>
+        </w:tc>
+      </w:tr>
+      <w:tr>
+        <w:tc>
+          <w:tcPr>
+            <w:tcW w:type="dxa" w:w="2160"/>
+          </w:tcPr>
+          <w:p>
+            <w:r>
+              <w:t>Enterprise onboarding scale-up</w:t>
+            </w:r>
+          </w:p>
+        </w:tc>
+        <w:tc>
+          <w:tcPr>
+            <w:tcW w:type="dxa" w:w="2160"/>
+          </w:tcPr>
+          <w:p>
+            <w:r>
+              <w:t>Customer Success</w:t>
+            </w:r>
+          </w:p>
+        </w:tc>
+        <w:tc>
+          <w:tcPr>
+            <w:tcW w:type="dxa" w:w="2160"/>
+          </w:tcPr>
+          <w:p>
+            <w:r>
+              <w:t>At risk</w:t>
+            </w:r>
+          </w:p>
+        </w:tc>
+        <w:tc>
+          <w:tcPr>
+            <w:tcW w:type="dxa" w:w="2160"/>
+          </w:tcPr>
+          <w:p>
+            <w:r>
+              <w:t>Hire and certify specialists</w:t>
+            </w:r>
+          </w:p>
+        </w:tc>
+      </w:tr>
+      <w:tr>
+        <w:tc>
+          <w:tcPr>
+            <w:tcW w:type="dxa" w:w="2160"/>
+          </w:tcPr>
+          <w:p>
+            <w:r>
+              <w:t>Analytics dashboard adoption</w:t>
+            </w:r>
+          </w:p>
+        </w:tc>
+        <w:tc>
+          <w:tcPr>
+            <w:tcW w:type="dxa" w:w="2160"/>
+          </w:tcPr>
+          <w:p>
+            <w:r>
+              <w:t>Product</w:t>
+            </w:r>
+          </w:p>
+        </w:tc>
+        <w:tc>
+          <w:tcPr>
+            <w:tcW w:type="dxa" w:w="2160"/>
+          </w:tcPr>
+          <w:p>
+            <w:r>
+              <w:t>On track</w:t>
+            </w:r>
+          </w:p>
+        </w:tc>
+        <w:tc>
+          <w:tcPr>
+            <w:tcW w:type="dxa" w:w="2160"/>
+          </w:tcPr>
+          <w:p>
+            <w:r>
+              <w:t>Drive usage in top 20 accounts</w:t>
+            </w:r>
+          </w:p>
+        </w:tc>
+      </w:tr>
+      <w:tr>
+        <w:tc>
+          <w:tcPr>
+            <w:tcW w:type="dxa" w:w="2160"/>
+          </w:tcPr>
+          <w:p>
+            <w:r>
+              <w:t>Partner enablement</w:t>
+            </w:r>
+          </w:p>
+        </w:tc>
+        <w:tc>
+          <w:tcPr>
+            <w:tcW w:type="dxa" w:w="2160"/>
+          </w:tcPr>
+          <w:p>
+            <w:r>
+              <w:t>Revenue</w:t>
+            </w:r>
+          </w:p>
+        </w:tc>
+        <w:tc>
+          <w:tcPr>
+            <w:tcW w:type="dxa" w:w="2160"/>
+          </w:tcPr>
+          <w:p>
+            <w:r>
+              <w:t>Needs focus</w:t>
+            </w:r>
+          </w:p>
+        </w:tc>
+        <w:tc>
+          <w:tcPr>
+            <w:tcW w:type="dxa" w:w="2160"/>
+          </w:tcPr>
+          <w:p>
+            <w:r>
+              <w:t>Launch enablement kit</w:t>
+            </w:r>
+          </w:p>
+        </w:tc>
+      </w:tr>
+      <w:tr>
+        <w:tc>
+          <w:tcPr>
+            <w:tcW w:type="dxa" w:w="2160"/>
+          </w:tcPr>
+          <w:p>
+            <w:r>
+              <w:t>Data import quality</w:t>
+            </w:r>
+          </w:p>
+        </w:tc>
+        <w:tc>
+          <w:tcPr>
+            <w:tcW w:type="dxa" w:w="2160"/>
+          </w:tcPr>
+          <w:p>
+            <w:r>
+              <w:t>Platform</w:t>
+            </w:r>
+          </w:p>
+        </w:tc>
+        <w:tc>
+          <w:tcPr>
+            <w:tcW w:type="dxa" w:w="2160"/>
+          </w:tcPr>
+          <w:p>
+            <w:r>
+              <w:t>On track</w:t>
+            </w:r>
+          </w:p>
+        </w:tc>
+        <w:tc>
+          <w:tcPr>
+            <w:tcW w:type="dxa" w:w="2160"/>
+          </w:tcPr>
+          <w:p>
+            <w:r>
+              <w:t>Add validation rules</w:t>
+            </w:r>
+          </w:p>
+        </w:tc>
+      </w:tr>
+    </w:tbl>
+    <w:p>
+      <w:r>
+        <w:t>End of sample source document.</w:t>
       </w:r>
     </w:p>
     <w:sectPr>
@@ -414,6 +1039,10 @@
     <w:name w:val="Normal"/>
     <w:qFormat/>
     <w:rsid w:val="00FC693F"/>
+    <w:rPr>
+      <w:rFonts w:ascii="Aptos" w:hAnsi="Aptos"/>
+      <w:sz w:val="21"/>
+    </w:rPr>
   </w:style>
   <w:style w:type="paragraph" w:styleId="Header">
     <w:name w:val="header"/>

</xml_diff>

<commit_message>
Refresh business report sample uploads
</commit_message>
<xml_diff>
--- a/sample_uploads/content.docx
+++ b/sample_uploads/content.docx
@@ -5,14 +5,21 @@
     <w:p>
       <w:pPr>
         <w:pStyle w:val="Title"/>
+        <w:jc w:val="center"/>
       </w:pPr>
       <w:r>
-        <w:t>Q1 Business Review</w:t>
+        <w:rPr>
+          <w:b/>
+        </w:rPr>
+        <w:t>Q2 2026 Business Review Source Brief</w:t>
       </w:r>
     </w:p>
     <w:p>
+      <w:pPr>
+        <w:jc w:val="center"/>
+      </w:pPr>
       <w:r>
-        <w:t>Prepared for management review. This document contains narrative sections and tables intended to exercise the Prompt-to-PPT parser, LLM outline generation, and final PPT builder.</w:t>
+        <w:t>Prepared for Board of Directors | July 2026 | Source content for Prompt-to-PPT transformation test</w:t>
       </w:r>
     </w:p>
     <w:p>
@@ -20,31 +27,22 @@
         <w:pStyle w:val="Heading1"/>
       </w:pPr>
       <w:r>
-        <w:t>Executive Snapshot</w:t>
+        <w:t>Executive Summary</w:t>
       </w:r>
     </w:p>
     <w:p>
-      <w:pPr>
-        <w:pStyle w:val="ListBullet"/>
-      </w:pPr>
       <w:r>
-        <w:t>Q1 closed ahead of plan with stronger enterprise demand and improved renewal discipline.</w:t>
+        <w:t>Q2 closed materially ahead of the Q1 baseline. Revenue reached $15.8M, representing 27% quarter-over-quarter growth. Gross margin expanded to 72% as enterprise mix improved and cloud optimization efforts reduced unit cost.</w:t>
       </w:r>
     </w:p>
     <w:p>
-      <w:pPr>
-        <w:pStyle w:val="ListBullet"/>
-      </w:pPr>
       <w:r>
-        <w:t>The team should emphasize expansion revenue, customer health, and delivery focus in the generated deck.</w:t>
+        <w:t>The management narrative should shift from Q1 efficiency recovery to Q2 durable enterprise acceleration. The board should see a clear upgrade in revenue quality, customer expansion, and pipeline confidence.</w:t>
       </w:r>
     </w:p>
     <w:p>
-      <w:pPr>
-        <w:pStyle w:val="ListBullet"/>
-      </w:pPr>
       <w:r>
-        <w:t>The primary decision is whether to increase Q2 investment in onboarding capacity and partner enablement.</w:t>
+        <w:t>Primary decision request: approve a targeted $650K investment in enterprise implementation capacity and customer success coverage while keeping brand spend gated by conversion evidence.</w:t>
       </w:r>
     </w:p>
     <w:p>
@@ -52,31 +50,304 @@
         <w:pStyle w:val="Heading1"/>
       </w:pPr>
       <w:r>
-        <w:t>Revenue Performance</w:t>
+        <w:t>Q2 Scorecard</w:t>
+      </w:r>
+    </w:p>
+    <w:tbl>
+      <w:tblPr>
+        <w:tblStyle w:val="TableGrid"/>
+        <w:tblW w:type="auto" w:w="0"/>
+        <w:jc w:val="center"/>
+        <w:tblLook w:firstColumn="1" w:firstRow="1" w:lastColumn="0" w:lastRow="0" w:noHBand="0" w:noVBand="1" w:val="04A0"/>
+      </w:tblPr>
+      <w:tblGrid>
+        <w:gridCol w:w="2520"/>
+        <w:gridCol w:w="2520"/>
+        <w:gridCol w:w="2520"/>
+        <w:gridCol w:w="2520"/>
+      </w:tblGrid>
+      <w:tr>
+        <w:tc>
+          <w:tcPr>
+            <w:tcW w:type="dxa" w:w="2520"/>
+          </w:tcPr>
+          <w:p>
+            <w:r>
+              <w:rPr>
+                <w:b/>
+              </w:rPr>
+              <w:t>Metric</w:t>
+            </w:r>
+          </w:p>
+        </w:tc>
+        <w:tc>
+          <w:tcPr>
+            <w:tcW w:type="dxa" w:w="2520"/>
+          </w:tcPr>
+          <w:p>
+            <w:r>
+              <w:rPr>
+                <w:b/>
+              </w:rPr>
+              <w:t>Q1 Baseline</w:t>
+            </w:r>
+          </w:p>
+        </w:tc>
+        <w:tc>
+          <w:tcPr>
+            <w:tcW w:type="dxa" w:w="2520"/>
+          </w:tcPr>
+          <w:p>
+            <w:r>
+              <w:rPr>
+                <w:b/>
+              </w:rPr>
+              <w:t>Q2 Actual</w:t>
+            </w:r>
+          </w:p>
+        </w:tc>
+        <w:tc>
+          <w:tcPr>
+            <w:tcW w:type="dxa" w:w="2520"/>
+          </w:tcPr>
+          <w:p>
+            <w:r>
+              <w:rPr>
+                <w:b/>
+              </w:rPr>
+              <w:t>Management Read</w:t>
+            </w:r>
+          </w:p>
+        </w:tc>
+      </w:tr>
+      <w:tr>
+        <w:tc>
+          <w:tcPr>
+            <w:tcW w:type="dxa" w:w="2520"/>
+          </w:tcPr>
+          <w:p>
+            <w:r>
+              <w:t>Revenue</w:t>
+            </w:r>
+          </w:p>
+        </w:tc>
+        <w:tc>
+          <w:tcPr>
+            <w:tcW w:type="dxa" w:w="2520"/>
+          </w:tcPr>
+          <w:p>
+            <w:r>
+              <w:t>$12.4M</w:t>
+            </w:r>
+          </w:p>
+        </w:tc>
+        <w:tc>
+          <w:tcPr>
+            <w:tcW w:type="dxa" w:w="2520"/>
+          </w:tcPr>
+          <w:p>
+            <w:r>
+              <w:t>$15.8M</w:t>
+            </w:r>
+          </w:p>
+        </w:tc>
+        <w:tc>
+          <w:tcPr>
+            <w:tcW w:type="dxa" w:w="2520"/>
+          </w:tcPr>
+          <w:p>
+            <w:r>
+              <w:t>Beat base plan by $1.1M and grew 27% QoQ</w:t>
+            </w:r>
+          </w:p>
+        </w:tc>
+      </w:tr>
+      <w:tr>
+        <w:tc>
+          <w:tcPr>
+            <w:tcW w:type="dxa" w:w="2520"/>
+          </w:tcPr>
+          <w:p>
+            <w:r>
+              <w:t>Gross Margin</w:t>
+            </w:r>
+          </w:p>
+        </w:tc>
+        <w:tc>
+          <w:tcPr>
+            <w:tcW w:type="dxa" w:w="2520"/>
+          </w:tcPr>
+          <w:p>
+            <w:r>
+              <w:t>64%</w:t>
+            </w:r>
+          </w:p>
+        </w:tc>
+        <w:tc>
+          <w:tcPr>
+            <w:tcW w:type="dxa" w:w="2520"/>
+          </w:tcPr>
+          <w:p>
+            <w:r>
+              <w:t>72%</w:t>
+            </w:r>
+          </w:p>
+        </w:tc>
+        <w:tc>
+          <w:tcPr>
+            <w:tcW w:type="dxa" w:w="2520"/>
+          </w:tcPr>
+          <w:p>
+            <w:r>
+              <w:t>Enterprise mix and AI cost controls improved margin</w:t>
+            </w:r>
+          </w:p>
+        </w:tc>
+      </w:tr>
+      <w:tr>
+        <w:tc>
+          <w:tcPr>
+            <w:tcW w:type="dxa" w:w="2520"/>
+          </w:tcPr>
+          <w:p>
+            <w:r>
+              <w:t>Net Revenue Retention</w:t>
+            </w:r>
+          </w:p>
+        </w:tc>
+        <w:tc>
+          <w:tcPr>
+            <w:tcW w:type="dxa" w:w="2520"/>
+          </w:tcPr>
+          <w:p>
+            <w:r>
+              <w:t>111%</w:t>
+            </w:r>
+          </w:p>
+        </w:tc>
+        <w:tc>
+          <w:tcPr>
+            <w:tcW w:type="dxa" w:w="2520"/>
+          </w:tcPr>
+          <w:p>
+            <w:r>
+              <w:t>118%</w:t>
+            </w:r>
+          </w:p>
+        </w:tc>
+        <w:tc>
+          <w:tcPr>
+            <w:tcW w:type="dxa" w:w="2520"/>
+          </w:tcPr>
+          <w:p>
+            <w:r>
+              <w:t>Expansion motion strengthened in top accounts</w:t>
+            </w:r>
+          </w:p>
+        </w:tc>
+      </w:tr>
+      <w:tr>
+        <w:tc>
+          <w:tcPr>
+            <w:tcW w:type="dxa" w:w="2520"/>
+          </w:tcPr>
+          <w:p>
+            <w:r>
+              <w:t>Pipeline Coverage</w:t>
+            </w:r>
+          </w:p>
+        </w:tc>
+        <w:tc>
+          <w:tcPr>
+            <w:tcW w:type="dxa" w:w="2520"/>
+          </w:tcPr>
+          <w:p>
+            <w:r>
+              <w:t>2.8x</w:t>
+            </w:r>
+          </w:p>
+        </w:tc>
+        <w:tc>
+          <w:tcPr>
+            <w:tcW w:type="dxa" w:w="2520"/>
+          </w:tcPr>
+          <w:p>
+            <w:r>
+              <w:t>3.6x</w:t>
+            </w:r>
+          </w:p>
+        </w:tc>
+        <w:tc>
+          <w:tcPr>
+            <w:tcW w:type="dxa" w:w="2520"/>
+          </w:tcPr>
+          <w:p>
+            <w:r>
+              <w:t>Q3 coverage is healthier than Q2 entry point</w:t>
+            </w:r>
+          </w:p>
+        </w:tc>
+      </w:tr>
+      <w:tr>
+        <w:tc>
+          <w:tcPr>
+            <w:tcW w:type="dxa" w:w="2520"/>
+          </w:tcPr>
+          <w:p>
+            <w:r>
+              <w:t>SMB Monthly Churn</w:t>
+            </w:r>
+          </w:p>
+        </w:tc>
+        <w:tc>
+          <w:tcPr>
+            <w:tcW w:type="dxa" w:w="2520"/>
+          </w:tcPr>
+          <w:p>
+            <w:r>
+              <w:t>3.1%</w:t>
+            </w:r>
+          </w:p>
+        </w:tc>
+        <w:tc>
+          <w:tcPr>
+            <w:tcW w:type="dxa" w:w="2520"/>
+          </w:tcPr>
+          <w:p>
+            <w:r>
+              <w:t>2.4%</w:t>
+            </w:r>
+          </w:p>
+        </w:tc>
+        <w:tc>
+          <w:tcPr>
+            <w:tcW w:type="dxa" w:w="2520"/>
+          </w:tcPr>
+          <w:p>
+            <w:r>
+              <w:t>Onboarding redesign is beginning to reduce churn</w:t>
+            </w:r>
+          </w:p>
+        </w:tc>
+      </w:tr>
+    </w:tbl>
+    <w:p/>
+    <w:p>
+      <w:pPr>
+        <w:pStyle w:val="Heading1"/>
+      </w:pPr>
+      <w:r>
+        <w:t>Revenue Trend and Forecast</w:t>
       </w:r>
     </w:p>
     <w:p>
-      <w:pPr>
-        <w:pStyle w:val="ListBullet"/>
-      </w:pPr>
       <w:r>
-        <w:t>Total revenue reached 18.4M, up 16 percent quarter over quarter and 9 percent above plan.</w:t>
+        <w:t>Monthly revenue increased from $4.8M in April to $5.6M in June. The quarter was not dependent on one large transaction: the top three expansion deals represented 31% of incremental ARR versus 46% in Q1.</w:t>
       </w:r>
     </w:p>
     <w:p>
-      <w:pPr>
-        <w:pStyle w:val="ListBullet"/>
-      </w:pPr>
       <w:r>
-        <w:t>Enterprise ARR contributed the majority of growth, with financial services and manufacturing outperforming forecast.</w:t>
-      </w:r>
-    </w:p>
-    <w:p>
-      <w:pPr>
-        <w:pStyle w:val="ListBullet"/>
-      </w:pPr>
-      <w:r>
-        <w:t>Services revenue was stable, but margin improved after tighter project scoping and lower subcontractor dependency.</w:t>
+        <w:t>Q3 forecast is $17.2M base case and $18.4M upside case. Upside depends on healthcare pipeline conversion and one strategic fintech renewal. Downside risk is implementation capacity, not demand generation.</w:t>
       </w:r>
     </w:p>
     <w:p>
@@ -84,63 +355,316 @@
         <w:pStyle w:val="Heading1"/>
       </w:pPr>
       <w:r>
-        <w:t>Customer Adoption</w:t>
+        <w:t>Segment Performance</w:t>
       </w:r>
     </w:p>
-    <w:p>
-      <w:pPr>
-        <w:pStyle w:val="ListBullet"/>
-      </w:pPr>
-      <w:r>
-        <w:t>Active enterprise accounts grew from 42 to 51, while weekly active users increased 28 percent.</w:t>
-      </w:r>
-    </w:p>
-    <w:p>
-      <w:pPr>
-        <w:pStyle w:val="ListBullet"/>
-      </w:pPr>
-      <w:r>
-        <w:t>The strongest adoption signal came from workflow automation features and analytics exports.</w:t>
-      </w:r>
-    </w:p>
-    <w:p>
-      <w:pPr>
-        <w:pStyle w:val="ListBullet"/>
-      </w:pPr>
-      <w:r>
-        <w:t>Three strategic accounts remain at risk because onboarding milestones slipped by more than two weeks.</w:t>
-      </w:r>
-    </w:p>
+    <w:tbl>
+      <w:tblPr>
+        <w:tblStyle w:val="TableGrid"/>
+        <w:tblW w:type="auto" w:w="0"/>
+        <w:jc w:val="center"/>
+        <w:tblLook w:firstColumn="1" w:firstRow="1" w:lastColumn="0" w:lastRow="0" w:noHBand="0" w:noVBand="1" w:val="04A0"/>
+      </w:tblPr>
+      <w:tblGrid>
+        <w:gridCol w:w="2016"/>
+        <w:gridCol w:w="2016"/>
+        <w:gridCol w:w="2016"/>
+        <w:gridCol w:w="2016"/>
+        <w:gridCol w:w="2016"/>
+      </w:tblGrid>
+      <w:tr>
+        <w:tc>
+          <w:tcPr>
+            <w:tcW w:type="dxa" w:w="2016"/>
+          </w:tcPr>
+          <w:p>
+            <w:r>
+              <w:rPr>
+                <w:b/>
+              </w:rPr>
+              <w:t>Segment</w:t>
+            </w:r>
+          </w:p>
+        </w:tc>
+        <w:tc>
+          <w:tcPr>
+            <w:tcW w:type="dxa" w:w="2016"/>
+          </w:tcPr>
+          <w:p>
+            <w:r>
+              <w:rPr>
+                <w:b/>
+              </w:rPr>
+              <w:t>Q2 Revenue</w:t>
+            </w:r>
+          </w:p>
+        </w:tc>
+        <w:tc>
+          <w:tcPr>
+            <w:tcW w:type="dxa" w:w="2016"/>
+          </w:tcPr>
+          <w:p>
+            <w:r>
+              <w:rPr>
+                <w:b/>
+              </w:rPr>
+              <w:t>QoQ Growth</w:t>
+            </w:r>
+          </w:p>
+        </w:tc>
+        <w:tc>
+          <w:tcPr>
+            <w:tcW w:type="dxa" w:w="2016"/>
+          </w:tcPr>
+          <w:p>
+            <w:r>
+              <w:rPr>
+                <w:b/>
+              </w:rPr>
+              <w:t>Gross Margin</w:t>
+            </w:r>
+          </w:p>
+        </w:tc>
+        <w:tc>
+          <w:tcPr>
+            <w:tcW w:type="dxa" w:w="2016"/>
+          </w:tcPr>
+          <w:p>
+            <w:r>
+              <w:rPr>
+                <w:b/>
+              </w:rPr>
+              <w:t>Board Message</w:t>
+            </w:r>
+          </w:p>
+        </w:tc>
+      </w:tr>
+      <w:tr>
+        <w:tc>
+          <w:tcPr>
+            <w:tcW w:type="dxa" w:w="2016"/>
+          </w:tcPr>
+          <w:p>
+            <w:r>
+              <w:t>Enterprise</w:t>
+            </w:r>
+          </w:p>
+        </w:tc>
+        <w:tc>
+          <w:tcPr>
+            <w:tcW w:type="dxa" w:w="2016"/>
+          </w:tcPr>
+          <w:p>
+            <w:r>
+              <w:t>$8.9M</w:t>
+            </w:r>
+          </w:p>
+        </w:tc>
+        <w:tc>
+          <w:tcPr>
+            <w:tcW w:type="dxa" w:w="2016"/>
+          </w:tcPr>
+          <w:p>
+            <w:r>
+              <w:t>+31%</w:t>
+            </w:r>
+          </w:p>
+        </w:tc>
+        <w:tc>
+          <w:tcPr>
+            <w:tcW w:type="dxa" w:w="2016"/>
+          </w:tcPr>
+          <w:p>
+            <w:r>
+              <w:t>76%</w:t>
+            </w:r>
+          </w:p>
+        </w:tc>
+        <w:tc>
+          <w:tcPr>
+            <w:tcW w:type="dxa" w:w="2016"/>
+          </w:tcPr>
+          <w:p>
+            <w:r>
+              <w:t>Best-quality growth engine; capacity is the constraint</w:t>
+            </w:r>
+          </w:p>
+        </w:tc>
+      </w:tr>
+      <w:tr>
+        <w:tc>
+          <w:tcPr>
+            <w:tcW w:type="dxa" w:w="2016"/>
+          </w:tcPr>
+          <w:p>
+            <w:r>
+              <w:t>Mid-market</w:t>
+            </w:r>
+          </w:p>
+        </w:tc>
+        <w:tc>
+          <w:tcPr>
+            <w:tcW w:type="dxa" w:w="2016"/>
+          </w:tcPr>
+          <w:p>
+            <w:r>
+              <w:t>$4.4M</w:t>
+            </w:r>
+          </w:p>
+        </w:tc>
+        <w:tc>
+          <w:tcPr>
+            <w:tcW w:type="dxa" w:w="2016"/>
+          </w:tcPr>
+          <w:p>
+            <w:r>
+              <w:t>+19%</w:t>
+            </w:r>
+          </w:p>
+        </w:tc>
+        <w:tc>
+          <w:tcPr>
+            <w:tcW w:type="dxa" w:w="2016"/>
+          </w:tcPr>
+          <w:p>
+            <w:r>
+              <w:t>68%</w:t>
+            </w:r>
+          </w:p>
+        </w:tc>
+        <w:tc>
+          <w:tcPr>
+            <w:tcW w:type="dxa" w:w="2016"/>
+          </w:tcPr>
+          <w:p>
+            <w:r>
+              <w:t>Stable growth with improved sales efficiency</w:t>
+            </w:r>
+          </w:p>
+        </w:tc>
+      </w:tr>
+      <w:tr>
+        <w:tc>
+          <w:tcPr>
+            <w:tcW w:type="dxa" w:w="2016"/>
+          </w:tcPr>
+          <w:p>
+            <w:r>
+              <w:t>SMB</w:t>
+            </w:r>
+          </w:p>
+        </w:tc>
+        <w:tc>
+          <w:tcPr>
+            <w:tcW w:type="dxa" w:w="2016"/>
+          </w:tcPr>
+          <w:p>
+            <w:r>
+              <w:t>$2.5M</w:t>
+            </w:r>
+          </w:p>
+        </w:tc>
+        <w:tc>
+          <w:tcPr>
+            <w:tcW w:type="dxa" w:w="2016"/>
+          </w:tcPr>
+          <w:p>
+            <w:r>
+              <w:t>+32%</w:t>
+            </w:r>
+          </w:p>
+        </w:tc>
+        <w:tc>
+          <w:tcPr>
+            <w:tcW w:type="dxa" w:w="2016"/>
+          </w:tcPr>
+          <w:p>
+            <w:r>
+              <w:t>56%</w:t>
+            </w:r>
+          </w:p>
+        </w:tc>
+        <w:tc>
+          <w:tcPr>
+            <w:tcW w:type="dxa" w:w="2016"/>
+          </w:tcPr>
+          <w:p>
+            <w:r>
+              <w:t>Churn improved but support burden remains watch item</w:t>
+            </w:r>
+          </w:p>
+        </w:tc>
+      </w:tr>
+      <w:tr>
+        <w:tc>
+          <w:tcPr>
+            <w:tcW w:type="dxa" w:w="2016"/>
+          </w:tcPr>
+          <w:p>
+            <w:r>
+              <w:t>Total</w:t>
+            </w:r>
+          </w:p>
+        </w:tc>
+        <w:tc>
+          <w:tcPr>
+            <w:tcW w:type="dxa" w:w="2016"/>
+          </w:tcPr>
+          <w:p>
+            <w:r>
+              <w:t>$15.8M</w:t>
+            </w:r>
+          </w:p>
+        </w:tc>
+        <w:tc>
+          <w:tcPr>
+            <w:tcW w:type="dxa" w:w="2016"/>
+          </w:tcPr>
+          <w:p>
+            <w:r>
+              <w:t>+27%</w:t>
+            </w:r>
+          </w:p>
+        </w:tc>
+        <w:tc>
+          <w:tcPr>
+            <w:tcW w:type="dxa" w:w="2016"/>
+          </w:tcPr>
+          <w:p>
+            <w:r>
+              <w:t>72%</w:t>
+            </w:r>
+          </w:p>
+        </w:tc>
+        <w:tc>
+          <w:tcPr>
+            <w:tcW w:type="dxa" w:w="2016"/>
+          </w:tcPr>
+          <w:p>
+            <w:r>
+              <w:t>Mix shift supports both growth and margin expansion</w:t>
+            </w:r>
+          </w:p>
+        </w:tc>
+      </w:tr>
+    </w:tbl>
+    <w:p/>
     <w:p>
       <w:pPr>
         <w:pStyle w:val="Heading1"/>
       </w:pPr>
       <w:r>
-        <w:t>Product Delivery</w:t>
+        <w:t>Customer and Pipeline Health</w:t>
       </w:r>
     </w:p>
     <w:p>
-      <w:pPr>
-        <w:pStyle w:val="ListBullet"/>
-      </w:pPr>
       <w:r>
-        <w:t>The product team shipped the analytics dashboard, workspace templates, and security audit trail in Q1.</w:t>
+        <w:t>Logo pipeline expanded to $57M qualified value, up from $42M at the end of Q1. Enterprise stage-3 conversion improved from 29% to 37% after solution-engineering coverage increased.</w:t>
       </w:r>
     </w:p>
     <w:p>
-      <w:pPr>
-        <w:pStyle w:val="ListBullet"/>
-      </w:pPr>
       <w:r>
-        <w:t>The roadmap is on track for API governance, improved admin controls, and workflow recommendations in Q2.</w:t>
-      </w:r>
-    </w:p>
-    <w:p>
-      <w:pPr>
-        <w:pStyle w:val="ListBullet"/>
-      </w:pPr>
-      <w:r>
-        <w:t>Platform reliability improved with median API latency down 19 percent and incident count down from 7 to 3.</w:t>
+        <w:t>Customer health is trending positive. Net revenue retention improved to 118%, gross logo retention reached 94%, and the number of accounts above $250K ARR increased from 18 to 24.</w:t>
       </w:r>
     </w:p>
     <w:p>
@@ -152,27 +676,18 @@
       </w:r>
     </w:p>
     <w:p>
-      <w:pPr>
-        <w:pStyle w:val="ListBullet"/>
-      </w:pPr>
       <w:r>
-        <w:t>Implementation capacity is the largest near-term risk as enterprise onboarding volume increases.</w:t>
+        <w:t>Implementation capacity is now the largest operating risk. If late-stage healthcare and fintech opportunities convert, current delivery staffing may create onboarding delays in September.</w:t>
       </w:r>
     </w:p>
     <w:p>
-      <w:pPr>
-        <w:pStyle w:val="ListBullet"/>
-      </w:pPr>
       <w:r>
-        <w:t>Data quality remains uneven across customer imports, which can slow time-to-value for complex deployments.</w:t>
+        <w:t>SMB churn improved but remains sensitive to product activation time. Management will continue onboarding experiments and will pause additional self-serve acquisition spend if churn rises above 2.6%.</w:t>
       </w:r>
     </w:p>
     <w:p>
-      <w:pPr>
-        <w:pStyle w:val="ListBullet"/>
-      </w:pPr>
       <w:r>
-        <w:t>Mitigation plan: add two onboarding specialists, publish stricter import validation, and expand partner training.</w:t>
+        <w:t>AI infrastructure cost is within the approved envelope after model-routing optimization. The team recommends keeping usage guardrails active until customer-level profitability dashboards are complete.</w:t>
       </w:r>
     </w:p>
     <w:p>
@@ -180,495 +695,22 @@
         <w:pStyle w:val="Heading1"/>
       </w:pPr>
       <w:r>
-        <w:t>Q2 Recommendations</w:t>
+        <w:t>Q3 Priorities and Decision Requests</w:t>
       </w:r>
     </w:p>
     <w:p>
-      <w:pPr>
-        <w:pStyle w:val="ListBullet"/>
-      </w:pPr>
       <w:r>
-        <w:t>Increase customer success capacity for strategic accounts before pipeline conversion peaks in May.</w:t>
+        <w:t>Priority 1: convert enterprise late-stage pipeline without stretching implementation quality. Priority 2: sustain gross margin above 70%. Priority 3: reduce SMB activation time below 6 days. Priority 4: operationalize account health scoring for customer success.</w:t>
       </w:r>
     </w:p>
     <w:p>
-      <w:pPr>
-        <w:pStyle w:val="ListBullet"/>
-      </w:pPr>
       <w:r>
-        <w:t>Prioritize automation analytics and admin controls because they are tied to expansion opportunities.</w:t>
-      </w:r>
-    </w:p>
-    <w:p>
-      <w:pPr>
-        <w:pStyle w:val="ListBullet"/>
-      </w:pPr>
-      <w:r>
-        <w:t>Create a weekly executive operating review around renewal risk, onboarding milestones, and product adoption.</w:t>
-      </w:r>
-    </w:p>
-    <w:tbl>
-      <w:tblPr>
-        <w:tblStyle w:val="TableGrid"/>
-        <w:tblW w:type="auto" w:w="0"/>
-        <w:tblLook w:firstColumn="1" w:firstRow="1" w:lastColumn="0" w:lastRow="0" w:noHBand="0" w:noVBand="1" w:val="04A0"/>
-      </w:tblPr>
-      <w:tblGrid>
-        <w:gridCol w:w="2160"/>
-        <w:gridCol w:w="2160"/>
-        <w:gridCol w:w="2160"/>
-        <w:gridCol w:w="2160"/>
-      </w:tblGrid>
-      <w:tr>
-        <w:tc>
-          <w:tcPr>
-            <w:tcW w:type="dxa" w:w="2160"/>
-          </w:tcPr>
-          <w:p>
-            <w:r>
-              <w:t>Metric</w:t>
-            </w:r>
-          </w:p>
-        </w:tc>
-        <w:tc>
-          <w:tcPr>
-            <w:tcW w:type="dxa" w:w="2160"/>
-          </w:tcPr>
-          <w:p>
-            <w:r>
-              <w:t>Q4 Actual</w:t>
-            </w:r>
-          </w:p>
-        </w:tc>
-        <w:tc>
-          <w:tcPr>
-            <w:tcW w:type="dxa" w:w="2160"/>
-          </w:tcPr>
-          <w:p>
-            <w:r>
-              <w:t>Q1 Actual</w:t>
-            </w:r>
-          </w:p>
-        </w:tc>
-        <w:tc>
-          <w:tcPr>
-            <w:tcW w:type="dxa" w:w="2160"/>
-          </w:tcPr>
-          <w:p>
-            <w:r>
-              <w:t>Q1 Plan</w:t>
-            </w:r>
-          </w:p>
-        </w:tc>
-      </w:tr>
-      <w:tr>
-        <w:tc>
-          <w:tcPr>
-            <w:tcW w:type="dxa" w:w="2160"/>
-          </w:tcPr>
-          <w:p>
-            <w:r>
-              <w:t>Revenue</w:t>
-            </w:r>
-          </w:p>
-        </w:tc>
-        <w:tc>
-          <w:tcPr>
-            <w:tcW w:type="dxa" w:w="2160"/>
-          </w:tcPr>
-          <w:p>
-            <w:r>
-              <w:t>15.9M</w:t>
-            </w:r>
-          </w:p>
-        </w:tc>
-        <w:tc>
-          <w:tcPr>
-            <w:tcW w:type="dxa" w:w="2160"/>
-          </w:tcPr>
-          <w:p>
-            <w:r>
-              <w:t>18.4M</w:t>
-            </w:r>
-          </w:p>
-        </w:tc>
-        <w:tc>
-          <w:tcPr>
-            <w:tcW w:type="dxa" w:w="2160"/>
-          </w:tcPr>
-          <w:p>
-            <w:r>
-              <w:t>16.9M</w:t>
-            </w:r>
-          </w:p>
-        </w:tc>
-      </w:tr>
-      <w:tr>
-        <w:tc>
-          <w:tcPr>
-            <w:tcW w:type="dxa" w:w="2160"/>
-          </w:tcPr>
-          <w:p>
-            <w:r>
-              <w:t>Gross Margin</w:t>
-            </w:r>
-          </w:p>
-        </w:tc>
-        <w:tc>
-          <w:tcPr>
-            <w:tcW w:type="dxa" w:w="2160"/>
-          </w:tcPr>
-          <w:p>
-            <w:r>
-              <w:t>63%</w:t>
-            </w:r>
-          </w:p>
-        </w:tc>
-        <w:tc>
-          <w:tcPr>
-            <w:tcW w:type="dxa" w:w="2160"/>
-          </w:tcPr>
-          <w:p>
-            <w:r>
-              <w:t>67%</w:t>
-            </w:r>
-          </w:p>
-        </w:tc>
-        <w:tc>
-          <w:tcPr>
-            <w:tcW w:type="dxa" w:w="2160"/>
-          </w:tcPr>
-          <w:p>
-            <w:r>
-              <w:t>65%</w:t>
-            </w:r>
-          </w:p>
-        </w:tc>
-      </w:tr>
-      <w:tr>
-        <w:tc>
-          <w:tcPr>
-            <w:tcW w:type="dxa" w:w="2160"/>
-          </w:tcPr>
-          <w:p>
-            <w:r>
-              <w:t>Net Revenue Retention</w:t>
-            </w:r>
-          </w:p>
-        </w:tc>
-        <w:tc>
-          <w:tcPr>
-            <w:tcW w:type="dxa" w:w="2160"/>
-          </w:tcPr>
-          <w:p>
-            <w:r>
-              <w:t>112%</w:t>
-            </w:r>
-          </w:p>
-        </w:tc>
-        <w:tc>
-          <w:tcPr>
-            <w:tcW w:type="dxa" w:w="2160"/>
-          </w:tcPr>
-          <w:p>
-            <w:r>
-              <w:t>119%</w:t>
-            </w:r>
-          </w:p>
-        </w:tc>
-        <w:tc>
-          <w:tcPr>
-            <w:tcW w:type="dxa" w:w="2160"/>
-          </w:tcPr>
-          <w:p>
-            <w:r>
-              <w:t>115%</w:t>
-            </w:r>
-          </w:p>
-        </w:tc>
-      </w:tr>
-      <w:tr>
-        <w:tc>
-          <w:tcPr>
-            <w:tcW w:type="dxa" w:w="2160"/>
-          </w:tcPr>
-          <w:p>
-            <w:r>
-              <w:t>Enterprise Accounts</w:t>
-            </w:r>
-          </w:p>
-        </w:tc>
-        <w:tc>
-          <w:tcPr>
-            <w:tcW w:type="dxa" w:w="2160"/>
-          </w:tcPr>
-          <w:p>
-            <w:r>
-              <w:t>42</w:t>
-            </w:r>
-          </w:p>
-        </w:tc>
-        <w:tc>
-          <w:tcPr>
-            <w:tcW w:type="dxa" w:w="2160"/>
-          </w:tcPr>
-          <w:p>
-            <w:r>
-              <w:t>51</w:t>
-            </w:r>
-          </w:p>
-        </w:tc>
-        <w:tc>
-          <w:tcPr>
-            <w:tcW w:type="dxa" w:w="2160"/>
-          </w:tcPr>
-          <w:p>
-            <w:r>
-              <w:t>48</w:t>
-            </w:r>
-          </w:p>
-        </w:tc>
-      </w:tr>
-    </w:tbl>
-    <w:p>
-      <w:pPr>
-        <w:pStyle w:val="Heading1"/>
-      </w:pPr>
-      <w:r>
-        <w:t>Initiative Status</w:t>
-      </w:r>
-    </w:p>
-    <w:tbl>
-      <w:tblPr>
-        <w:tblStyle w:val="TableGrid"/>
-        <w:tblW w:type="auto" w:w="0"/>
-        <w:tblLook w:firstColumn="1" w:firstRow="1" w:lastColumn="0" w:lastRow="0" w:noHBand="0" w:noVBand="1" w:val="04A0"/>
-      </w:tblPr>
-      <w:tblGrid>
-        <w:gridCol w:w="2160"/>
-        <w:gridCol w:w="2160"/>
-        <w:gridCol w:w="2160"/>
-        <w:gridCol w:w="2160"/>
-      </w:tblGrid>
-      <w:tr>
-        <w:tc>
-          <w:tcPr>
-            <w:tcW w:type="dxa" w:w="2160"/>
-          </w:tcPr>
-          <w:p>
-            <w:r>
-              <w:t>Initiative</w:t>
-            </w:r>
-          </w:p>
-        </w:tc>
-        <w:tc>
-          <w:tcPr>
-            <w:tcW w:type="dxa" w:w="2160"/>
-          </w:tcPr>
-          <w:p>
-            <w:r>
-              <w:t>Owner</w:t>
-            </w:r>
-          </w:p>
-        </w:tc>
-        <w:tc>
-          <w:tcPr>
-            <w:tcW w:type="dxa" w:w="2160"/>
-          </w:tcPr>
-          <w:p>
-            <w:r>
-              <w:t>Status</w:t>
-            </w:r>
-          </w:p>
-        </w:tc>
-        <w:tc>
-          <w:tcPr>
-            <w:tcW w:type="dxa" w:w="2160"/>
-          </w:tcPr>
-          <w:p>
-            <w:r>
-              <w:t>Q2 Focus</w:t>
-            </w:r>
-          </w:p>
-        </w:tc>
-      </w:tr>
-      <w:tr>
-        <w:tc>
-          <w:tcPr>
-            <w:tcW w:type="dxa" w:w="2160"/>
-          </w:tcPr>
-          <w:p>
-            <w:r>
-              <w:t>Enterprise onboarding scale-up</w:t>
-            </w:r>
-          </w:p>
-        </w:tc>
-        <w:tc>
-          <w:tcPr>
-            <w:tcW w:type="dxa" w:w="2160"/>
-          </w:tcPr>
-          <w:p>
-            <w:r>
-              <w:t>Customer Success</w:t>
-            </w:r>
-          </w:p>
-        </w:tc>
-        <w:tc>
-          <w:tcPr>
-            <w:tcW w:type="dxa" w:w="2160"/>
-          </w:tcPr>
-          <w:p>
-            <w:r>
-              <w:t>At risk</w:t>
-            </w:r>
-          </w:p>
-        </w:tc>
-        <w:tc>
-          <w:tcPr>
-            <w:tcW w:type="dxa" w:w="2160"/>
-          </w:tcPr>
-          <w:p>
-            <w:r>
-              <w:t>Hire and certify specialists</w:t>
-            </w:r>
-          </w:p>
-        </w:tc>
-      </w:tr>
-      <w:tr>
-        <w:tc>
-          <w:tcPr>
-            <w:tcW w:type="dxa" w:w="2160"/>
-          </w:tcPr>
-          <w:p>
-            <w:r>
-              <w:t>Analytics dashboard adoption</w:t>
-            </w:r>
-          </w:p>
-        </w:tc>
-        <w:tc>
-          <w:tcPr>
-            <w:tcW w:type="dxa" w:w="2160"/>
-          </w:tcPr>
-          <w:p>
-            <w:r>
-              <w:t>Product</w:t>
-            </w:r>
-          </w:p>
-        </w:tc>
-        <w:tc>
-          <w:tcPr>
-            <w:tcW w:type="dxa" w:w="2160"/>
-          </w:tcPr>
-          <w:p>
-            <w:r>
-              <w:t>On track</w:t>
-            </w:r>
-          </w:p>
-        </w:tc>
-        <w:tc>
-          <w:tcPr>
-            <w:tcW w:type="dxa" w:w="2160"/>
-          </w:tcPr>
-          <w:p>
-            <w:r>
-              <w:t>Drive usage in top 20 accounts</w:t>
-            </w:r>
-          </w:p>
-        </w:tc>
-      </w:tr>
-      <w:tr>
-        <w:tc>
-          <w:tcPr>
-            <w:tcW w:type="dxa" w:w="2160"/>
-          </w:tcPr>
-          <w:p>
-            <w:r>
-              <w:t>Partner enablement</w:t>
-            </w:r>
-          </w:p>
-        </w:tc>
-        <w:tc>
-          <w:tcPr>
-            <w:tcW w:type="dxa" w:w="2160"/>
-          </w:tcPr>
-          <w:p>
-            <w:r>
-              <w:t>Revenue</w:t>
-            </w:r>
-          </w:p>
-        </w:tc>
-        <w:tc>
-          <w:tcPr>
-            <w:tcW w:type="dxa" w:w="2160"/>
-          </w:tcPr>
-          <w:p>
-            <w:r>
-              <w:t>Needs focus</w:t>
-            </w:r>
-          </w:p>
-        </w:tc>
-        <w:tc>
-          <w:tcPr>
-            <w:tcW w:type="dxa" w:w="2160"/>
-          </w:tcPr>
-          <w:p>
-            <w:r>
-              <w:t>Launch enablement kit</w:t>
-            </w:r>
-          </w:p>
-        </w:tc>
-      </w:tr>
-      <w:tr>
-        <w:tc>
-          <w:tcPr>
-            <w:tcW w:type="dxa" w:w="2160"/>
-          </w:tcPr>
-          <w:p>
-            <w:r>
-              <w:t>Data import quality</w:t>
-            </w:r>
-          </w:p>
-        </w:tc>
-        <w:tc>
-          <w:tcPr>
-            <w:tcW w:type="dxa" w:w="2160"/>
-          </w:tcPr>
-          <w:p>
-            <w:r>
-              <w:t>Platform</w:t>
-            </w:r>
-          </w:p>
-        </w:tc>
-        <w:tc>
-          <w:tcPr>
-            <w:tcW w:type="dxa" w:w="2160"/>
-          </w:tcPr>
-          <w:p>
-            <w:r>
-              <w:t>On track</w:t>
-            </w:r>
-          </w:p>
-        </w:tc>
-        <w:tc>
-          <w:tcPr>
-            <w:tcW w:type="dxa" w:w="2160"/>
-          </w:tcPr>
-          <w:p>
-            <w:r>
-              <w:t>Add validation rules</w:t>
-            </w:r>
-          </w:p>
-        </w:tc>
-      </w:tr>
-    </w:tbl>
-    <w:p>
-      <w:r>
-        <w:t>End of sample source document.</w:t>
+        <w:t>Board approval requested: $650K for enterprise implementation and customer success capacity, conditional release of $300K brand spend after two consecutive months of stage-3 conversion above 35%, and approval to expand AI infrastructure budget by up to $180K if tied to signed enterprise deployments.</w:t>
       </w:r>
     </w:p>
     <w:sectPr>
       <w:pgSz w:w="12240" w:h="15840"/>
-      <w:pgMar w:top="1440" w:right="1800" w:bottom="1440" w:left="1800" w:header="720" w:footer="720" w:gutter="0"/>
+      <w:pgMar w:top="936" w:right="1080" w:bottom="936" w:left="1080" w:header="720" w:footer="720" w:gutter="0"/>
       <w:cols w:space="720"/>
       <w:docGrid w:linePitch="360"/>
     </w:sectPr>
@@ -1103,10 +1145,10 @@
       <w:outlineLvl w:val="0"/>
     </w:pPr>
     <w:rPr>
-      <w:rFonts w:asciiTheme="majorHAnsi" w:eastAsiaTheme="majorEastAsia" w:hAnsiTheme="majorHAnsi" w:cstheme="majorBidi"/>
+      <w:rFonts w:asciiTheme="majorHAnsi" w:eastAsiaTheme="majorEastAsia" w:hAnsiTheme="majorHAnsi" w:cstheme="majorBidi" w:ascii="Aptos Display" w:hAnsi="Aptos Display"/>
       <w:b/>
       <w:bCs/>
-      <w:color w:val="365F91" w:themeColor="accent1" w:themeShade="BF"/>
+      <w:color w:val="0F2038"/>
       <w:sz w:val="28"/>
       <w:szCs w:val="28"/>
     </w:rPr>
@@ -1127,10 +1169,10 @@
       <w:outlineLvl w:val="1"/>
     </w:pPr>
     <w:rPr>
-      <w:rFonts w:asciiTheme="majorHAnsi" w:eastAsiaTheme="majorEastAsia" w:hAnsiTheme="majorHAnsi" w:cstheme="majorBidi"/>
+      <w:rFonts w:asciiTheme="majorHAnsi" w:eastAsiaTheme="majorEastAsia" w:hAnsiTheme="majorHAnsi" w:cstheme="majorBidi" w:ascii="Aptos Display" w:hAnsi="Aptos Display"/>
       <w:b/>
       <w:bCs/>
-      <w:color w:val="4F81BD" w:themeColor="accent1"/>
+      <w:color w:val="0F2038"/>
       <w:sz w:val="26"/>
       <w:szCs w:val="26"/>
     </w:rPr>
@@ -1392,8 +1434,8 @@
       <w:contextualSpacing/>
     </w:pPr>
     <w:rPr>
-      <w:rFonts w:asciiTheme="majorHAnsi" w:eastAsiaTheme="majorEastAsia" w:hAnsiTheme="majorHAnsi" w:cstheme="majorBidi"/>
-      <w:color w:val="17365D" w:themeColor="text2" w:themeShade="BF"/>
+      <w:rFonts w:asciiTheme="majorHAnsi" w:eastAsiaTheme="majorEastAsia" w:hAnsiTheme="majorHAnsi" w:cstheme="majorBidi" w:ascii="Aptos Display" w:hAnsi="Aptos Display"/>
+      <w:color w:val="0F2038"/>
       <w:spacing w:val="5"/>
       <w:kern w:val="28"/>
       <w:sz w:val="52"/>

</xml_diff>